<commit_message>
EXP0093 hard factorial incl. Turbo; manuscript V3 with data-driven claims; slide assets
</commit_message>
<xml_diff>
--- a/VRL_中文论文初稿_V3_20261011.docx
+++ b/VRL_中文论文初稿_V3_20261011.docx
@@ -29,7 +29,7 @@
         <w:rPr>
           <w:b w:val="0"/>
         </w:rPr>
-        <w:t>磁性微机器人及其集群已能在血管内完成靶向递药、血栓破除等操作。将这些能力推向临床，需要在不同患者的血管、未知且时变的血流以及延迟的成像反馈下，让多个集群自主、高效、安全地完成多点血栓清除。本文把这一问题形式化为"已知几何、未知动力学"的多集群导航任务：术前 CTA 给出血管中心线、健康半径和血栓位置，而血流强度与脉动、集群对磁场指令的响应、近壁作用和溶解速率因人因时而异，控制器只能获得延迟的双平面图像估计。我们提出一个分层框架。全局层用测地分配与时序计划图（TPG）决定"谁去哪个血栓、按什么顺序通过冲突区"；局部层用一个动作条件化的学习运动预测器集成，预测候选指令在未来 1.2 s 内造成的真实位移及其不确定性，在以经典规则为锚的候选集中选择指令，并在认知不确定性过高时回退到规则。所有方法共享同一壁护、TPG 等待与间距护盾。在 14 种血管解剖、N = 1–3 个集群、6 类流速—延迟—动力学条件构成的 252 个配对场景上，本文框架（3 个完全独立的预测器种子）的 Strict 成功率为 61.2% ± 1.8%，比本项目最强经典规则 SwitchSettle 高 +13.6 个百分点（95% CI [+8.1, +18.9]），也优于以 PAC-NMPC、MPPI、CBF-QP、Turbo 强化学习为局部层，以 STPG、最优传输分配为全局层的全部外部方法组合（最佳外部组合 46.2%）。学习预测器在留出解剖上把 1.2 s 位置误差降至 0.128 mm（在线估计器 0.166 mm），并给出校准的不确定性（2σ 覆盖率 0.96）。但配对消融显示，在控制效果上它与同一选择器配非学习在线估计器的版本相当（-1.1 pp，[-3.3, +1.2]）；在弱流、低延迟设定下，框架仍落后于固定减速规则。这些结果表明，"预测—选择"结构是困难条件下性能提升的主要来源，而如何把更准确的学习预测转化为控制增益，是下一步的关键问题。</w:t>
+        <w:t>磁性微机器人及其集群已能在血管内完成靶向递药、血栓破除等操作。将这些能力推向临床，需要在不同患者的血管、未知且时变的血流以及延迟的成像反馈下，让多个集群自主、高效、安全地完成多点血栓清除。本文把这一问题形式化为"已知几何、未知动力学"的多集群导航任务：术前 CTA 给出血管中心线、健康半径和血栓位置，而血流强度与脉动、集群对磁场指令的响应、近壁作用和溶解速率因人因时而异，控制器只能获得延迟的双平面图像估计。我们提出一个分层框架。全局层用测地分配与时序计划图（TPG）决定"谁去哪个血栓、按什么顺序通过冲突区"；局部层用一个动作条件化的学习运动预测器集成，预测候选指令在未来 1.2 s 内造成的真实位移及其不确定性，在以经典规则为锚的候选集中选择指令，并在认知不确定性过高时回退到规则。所有方法共享同一壁护、TPG 等待与间距护盾。在 14 种血管解剖、N = 1–3 个集群、6 类流速—延迟—动力学条件构成的 252 个配对场景上，本文框架（3 个完全独立的预测器种子）的 Strict 成功率为 61.2% ± 1.8%，比本项目最强经典规则 SwitchSettle 高 +13.6 个百分点（95% CI [+8.1, +18.9]），在“全局层 × 局部层”因子化对比中显著优于以 PAC-NMPC、MPPI、CBF-QP、Turbo 强化学习为局部层，以 STPG、最优传输分配为全局层的外部方法组合（最佳外部组合 40.1%）。学习预测器在留出解剖上把 1.2 s 位置误差降至 0.128 mm（在线估计器 0.166 mm），并给出校准的不确定性（2σ 覆盖率 0.96）。但配对消融显示，在控制效果上它与同一选择器配非学习在线估计器的版本相当（-1.1 pp，[-3.3, +1.2]）；在弱流、低延迟设定下，框架仍落后于固定减速规则。这些结果表明，"预测—选择"结构是困难条件下性能提升的主要来源，而如何把更准确的学习预测转化为控制增益，是下一步的关键问题。</w:t>
       </w:r>
     </w:p>
     <w:p>
@@ -2719,7 +2719,7 @@
         <w:rPr>
           <w:b w:val="0"/>
         </w:rPr>
-        <w:t>表3  困难矩阵上全局层 × 局部层的全部组合（13 个共同配对场景）。本文 = 测地分配+TPG / 学习预测选择（预测器种子 A）。</w:t>
+        <w:t>表3  困难矩阵上全局层 × 局部层的全部组合（252 个共同配对场景）。本文 = 测地分配+TPG / 学习预测选择（预测器种子 A）。</w:t>
       </w:r>
     </w:p>
     <w:tbl>
@@ -2947,7 +2947,7 @@
               <w:rPr>
                 <w:sz w:val="14"/>
               </w:rPr>
-              <w:t>84.6</w:t>
+              <w:t>63.1</w:t>
             </w:r>
           </w:p>
         </w:tc>
@@ -2961,7 +2961,7 @@
               <w:rPr>
                 <w:sz w:val="14"/>
               </w:rPr>
-              <w:t>94.4</w:t>
+              <w:t>83.7</w:t>
             </w:r>
           </w:p>
         </w:tc>
@@ -2975,7 +2975,7 @@
               <w:rPr>
                 <w:sz w:val="14"/>
               </w:rPr>
-              <w:t>73.7</w:t>
+              <w:t>66.9</w:t>
             </w:r>
           </w:p>
         </w:tc>
@@ -2989,7 +2989,7 @@
               <w:rPr>
                 <w:sz w:val="14"/>
               </w:rPr>
-              <w:t>130</w:t>
+              <w:t>168</w:t>
             </w:r>
           </w:p>
         </w:tc>
@@ -3003,7 +3003,7 @@
               <w:rPr>
                 <w:sz w:val="14"/>
               </w:rPr>
-              <w:t>0.01</w:t>
+              <w:t>5.37</w:t>
             </w:r>
           </w:p>
         </w:tc>
@@ -3017,7 +3017,7 @@
               <w:rPr>
                 <w:sz w:val="14"/>
               </w:rPr>
-              <w:t>0.0</w:t>
+              <w:t>8.7</w:t>
             </w:r>
           </w:p>
         </w:tc>
@@ -3031,7 +3031,7 @@
               <w:rPr>
                 <w:sz w:val="14"/>
               </w:rPr>
-              <w:t>0.000</w:t>
+              <w:t>0.001</w:t>
             </w:r>
           </w:p>
         </w:tc>
@@ -3045,7 +3045,7 @@
               <w:rPr>
                 <w:sz w:val="14"/>
               </w:rPr>
-              <w:t>0.00</w:t>
+              <w:t>1.18</w:t>
             </w:r>
           </w:p>
         </w:tc>
@@ -3103,7 +3103,7 @@
               <w:rPr>
                 <w:sz w:val="14"/>
               </w:rPr>
-              <w:t>84.6</w:t>
+              <w:t>62.3</w:t>
             </w:r>
           </w:p>
         </w:tc>
@@ -3117,7 +3117,7 @@
               <w:rPr>
                 <w:sz w:val="14"/>
               </w:rPr>
-              <w:t>94.4</w:t>
+              <w:t>83.5</w:t>
             </w:r>
           </w:p>
         </w:tc>
@@ -3131,7 +3131,7 @@
               <w:rPr>
                 <w:sz w:val="14"/>
               </w:rPr>
-              <w:t>74.2</w:t>
+              <w:t>66.6</w:t>
             </w:r>
           </w:p>
         </w:tc>
@@ -3145,7 +3145,7 @@
               <w:rPr>
                 <w:sz w:val="14"/>
               </w:rPr>
-              <w:t>127</w:t>
+              <w:t>170</w:t>
             </w:r>
           </w:p>
         </w:tc>
@@ -3159,7 +3159,7 @@
               <w:rPr>
                 <w:sz w:val="14"/>
               </w:rPr>
-              <w:t>0.00</w:t>
+              <w:t>6.62</w:t>
             </w:r>
           </w:p>
         </w:tc>
@@ -3173,7 +3173,7 @@
               <w:rPr>
                 <w:sz w:val="14"/>
               </w:rPr>
-              <w:t>0.0</w:t>
+              <w:t>8.7</w:t>
             </w:r>
           </w:p>
         </w:tc>
@@ -3187,7 +3187,7 @@
               <w:rPr>
                 <w:sz w:val="14"/>
               </w:rPr>
-              <w:t>0.000</w:t>
+              <w:t>0.002</w:t>
             </w:r>
           </w:p>
         </w:tc>
@@ -3201,7 +3201,7 @@
               <w:rPr>
                 <w:sz w:val="14"/>
               </w:rPr>
-              <w:t>0.00</w:t>
+              <w:t>1.24</w:t>
             </w:r>
           </w:p>
         </w:tc>
@@ -3215,7 +3215,7 @@
               <w:rPr>
                 <w:sz w:val="14"/>
               </w:rPr>
-              <w:t>+0.0 [+0.0, +0.0]</w:t>
+              <w:t>+0.8 [-1.6, +3.2]</w:t>
             </w:r>
           </w:p>
         </w:tc>
@@ -3259,7 +3259,7 @@
               <w:rPr>
                 <w:sz w:val="14"/>
               </w:rPr>
-              <w:t>46.2</w:t>
+              <w:t>40.1</w:t>
             </w:r>
           </w:p>
         </w:tc>
@@ -3273,7 +3273,7 @@
               <w:rPr>
                 <w:sz w:val="14"/>
               </w:rPr>
-              <w:t>71.4</w:t>
+              <w:t>68.1</w:t>
             </w:r>
           </w:p>
         </w:tc>
@@ -3287,7 +3287,7 @@
               <w:rPr>
                 <w:sz w:val="14"/>
               </w:rPr>
-              <w:t>58.5</w:t>
+              <w:t>54.3</w:t>
             </w:r>
           </w:p>
         </w:tc>
@@ -3301,7 +3301,7 @@
               <w:rPr>
                 <w:sz w:val="14"/>
               </w:rPr>
-              <w:t>190</w:t>
+              <w:t>215</w:t>
             </w:r>
           </w:p>
         </w:tc>
@@ -3315,7 +3315,7 @@
               <w:rPr>
                 <w:sz w:val="14"/>
               </w:rPr>
-              <w:t>0.00</w:t>
+              <w:t>3.12</w:t>
             </w:r>
           </w:p>
         </w:tc>
@@ -3329,7 +3329,7 @@
               <w:rPr>
                 <w:sz w:val="14"/>
               </w:rPr>
-              <w:t>0.0</w:t>
+              <w:t>6.3</w:t>
             </w:r>
           </w:p>
         </w:tc>
@@ -3343,7 +3343,7 @@
               <w:rPr>
                 <w:sz w:val="14"/>
               </w:rPr>
-              <w:t>0.000</w:t>
+              <w:t>0.009</w:t>
             </w:r>
           </w:p>
         </w:tc>
@@ -3357,7 +3357,7 @@
               <w:rPr>
                 <w:sz w:val="14"/>
               </w:rPr>
-              <w:t>0.00</w:t>
+              <w:t>1.22</w:t>
             </w:r>
           </w:p>
         </w:tc>
@@ -3371,7 +3371,7 @@
               <w:rPr>
                 <w:sz w:val="14"/>
               </w:rPr>
-              <w:t>+38.5 [+15.4, +61.5]</w:t>
+              <w:t>+23.0 [+17.1, +29.0]</w:t>
             </w:r>
           </w:p>
         </w:tc>
@@ -3415,7 +3415,7 @@
               <w:rPr>
                 <w:sz w:val="14"/>
               </w:rPr>
-              <w:t>46.2</w:t>
+              <w:t>32.1</w:t>
             </w:r>
           </w:p>
         </w:tc>
@@ -3429,7 +3429,7 @@
               <w:rPr>
                 <w:sz w:val="14"/>
               </w:rPr>
-              <w:t>73.2</w:t>
+              <w:t>60.3</w:t>
             </w:r>
           </w:p>
         </w:tc>
@@ -3443,7 +3443,7 @@
               <w:rPr>
                 <w:sz w:val="14"/>
               </w:rPr>
-              <w:t>58.2</w:t>
+              <w:t>47.5</w:t>
             </w:r>
           </w:p>
         </w:tc>
@@ -3457,7 +3457,7 @@
               <w:rPr>
                 <w:sz w:val="14"/>
               </w:rPr>
-              <w:t>202</w:t>
+              <w:t>238</w:t>
             </w:r>
           </w:p>
         </w:tc>
@@ -3471,7 +3471,7 @@
               <w:rPr>
                 <w:sz w:val="14"/>
               </w:rPr>
-              <w:t>0.04</w:t>
+              <w:t>4.26</w:t>
             </w:r>
           </w:p>
         </w:tc>
@@ -3485,7 +3485,7 @@
               <w:rPr>
                 <w:sz w:val="14"/>
               </w:rPr>
-              <w:t>0.0</w:t>
+              <w:t>5.2</w:t>
             </w:r>
           </w:p>
         </w:tc>
@@ -3513,7 +3513,7 @@
               <w:rPr>
                 <w:sz w:val="14"/>
               </w:rPr>
-              <w:t>0.00</w:t>
+              <w:t>1.02</w:t>
             </w:r>
           </w:p>
         </w:tc>
@@ -3527,7 +3527,7 @@
               <w:rPr>
                 <w:sz w:val="14"/>
               </w:rPr>
-              <w:t>+38.5 [+15.4, +61.5]</w:t>
+              <w:t>+31.0 [+24.2, +37.7]</w:t>
             </w:r>
           </w:p>
         </w:tc>
@@ -3571,7 +3571,7 @@
               <w:rPr>
                 <w:sz w:val="14"/>
               </w:rPr>
-              <w:t>46.2</w:t>
+              <w:t>37.7</w:t>
             </w:r>
           </w:p>
         </w:tc>
@@ -3585,7 +3585,7 @@
               <w:rPr>
                 <w:sz w:val="14"/>
               </w:rPr>
-              <w:t>69.5</w:t>
+              <w:t>67.4</w:t>
             </w:r>
           </w:p>
         </w:tc>
@@ -3599,7 +3599,7 @@
               <w:rPr>
                 <w:sz w:val="14"/>
               </w:rPr>
-              <w:t>56.0</w:t>
+              <w:t>53.5</w:t>
             </w:r>
           </w:p>
         </w:tc>
@@ -3613,7 +3613,7 @@
               <w:rPr>
                 <w:sz w:val="14"/>
               </w:rPr>
-              <w:t>196</w:t>
+              <w:t>219</w:t>
             </w:r>
           </w:p>
         </w:tc>
@@ -3627,7 +3627,7 @@
               <w:rPr>
                 <w:sz w:val="14"/>
               </w:rPr>
-              <w:t>3.73</w:t>
+              <w:t>5.54</w:t>
             </w:r>
           </w:p>
         </w:tc>
@@ -3641,7 +3641,7 @@
               <w:rPr>
                 <w:sz w:val="14"/>
               </w:rPr>
-              <w:t>7.7</w:t>
+              <w:t>11.9</w:t>
             </w:r>
           </w:p>
         </w:tc>
@@ -3655,7 +3655,7 @@
               <w:rPr>
                 <w:sz w:val="14"/>
               </w:rPr>
-              <w:t>0.000</w:t>
+              <w:t>0.020</w:t>
             </w:r>
           </w:p>
         </w:tc>
@@ -3669,7 +3669,7 @@
               <w:rPr>
                 <w:sz w:val="14"/>
               </w:rPr>
-              <w:t>0.00</w:t>
+              <w:t>1.25</w:t>
             </w:r>
           </w:p>
         </w:tc>
@@ -3683,7 +3683,7 @@
               <w:rPr>
                 <w:sz w:val="14"/>
               </w:rPr>
-              <w:t>+38.5 [+15.4, +61.5]</w:t>
+              <w:t>+25.4 [+19.0, +31.7]</w:t>
             </w:r>
           </w:p>
         </w:tc>
@@ -3727,7 +3727,7 @@
               <w:rPr>
                 <w:sz w:val="14"/>
               </w:rPr>
-              <w:t>7.7</w:t>
+              <w:t>18.7</w:t>
             </w:r>
           </w:p>
         </w:tc>
@@ -3741,7 +3741,7 @@
               <w:rPr>
                 <w:sz w:val="14"/>
               </w:rPr>
-              <w:t>36.6</w:t>
+              <w:t>54.2</w:t>
             </w:r>
           </w:p>
         </w:tc>
@@ -3755,7 +3755,7 @@
               <w:rPr>
                 <w:sz w:val="14"/>
               </w:rPr>
-              <w:t>33.2</w:t>
+              <w:t>44.6</w:t>
             </w:r>
           </w:p>
         </w:tc>
@@ -3769,7 +3769,7 @@
               <w:rPr>
                 <w:sz w:val="14"/>
               </w:rPr>
-              <w:t>282</w:t>
+              <w:t>261</w:t>
             </w:r>
           </w:p>
         </w:tc>
@@ -3783,7 +3783,7 @@
               <w:rPr>
                 <w:sz w:val="14"/>
               </w:rPr>
-              <w:t>57.52</w:t>
+              <w:t>20.47</w:t>
             </w:r>
           </w:p>
         </w:tc>
@@ -3797,7 +3797,7 @@
               <w:rPr>
                 <w:sz w:val="14"/>
               </w:rPr>
-              <w:t>46.2</w:t>
+              <w:t>24.2</w:t>
             </w:r>
           </w:p>
         </w:tc>
@@ -3811,7 +3811,7 @@
               <w:rPr>
                 <w:sz w:val="14"/>
               </w:rPr>
-              <w:t>0.340</w:t>
+              <w:t>0.242</w:t>
             </w:r>
           </w:p>
         </w:tc>
@@ -3825,7 +3825,7 @@
               <w:rPr>
                 <w:sz w:val="14"/>
               </w:rPr>
-              <w:t>10.88</w:t>
+              <w:t>2.90</w:t>
             </w:r>
           </w:p>
         </w:tc>
@@ -3839,7 +3839,7 @@
               <w:rPr>
                 <w:sz w:val="14"/>
               </w:rPr>
-              <w:t>+76.9 [+53.8, +100.0]</w:t>
+              <w:t>+44.4 [+38.5, +50.8]</w:t>
             </w:r>
           </w:p>
         </w:tc>
@@ -3897,7 +3897,7 @@
               <w:rPr>
                 <w:sz w:val="14"/>
               </w:rPr>
-              <w:t>15.4</w:t>
+              <w:t>12.8</w:t>
             </w:r>
           </w:p>
         </w:tc>
@@ -3911,7 +3911,7 @@
               <w:rPr>
                 <w:sz w:val="14"/>
               </w:rPr>
-              <w:t>11.7</w:t>
+              <w:t>9.4</w:t>
             </w:r>
           </w:p>
         </w:tc>
@@ -3939,7 +3939,7 @@
               <w:rPr>
                 <w:sz w:val="14"/>
               </w:rPr>
-              <w:t>6.43</w:t>
+              <w:t>2.98</w:t>
             </w:r>
           </w:p>
         </w:tc>
@@ -3953,7 +3953,7 @@
               <w:rPr>
                 <w:sz w:val="14"/>
               </w:rPr>
-              <w:t>7.7</w:t>
+              <w:t>6.7</w:t>
             </w:r>
           </w:p>
         </w:tc>
@@ -3981,7 +3981,7 @@
               <w:rPr>
                 <w:sz w:val="14"/>
               </w:rPr>
-              <w:t>0.00</w:t>
+              <w:t>0.01</w:t>
             </w:r>
           </w:p>
         </w:tc>
@@ -3995,7 +3995,7 @@
               <w:rPr>
                 <w:sz w:val="14"/>
               </w:rPr>
-              <w:t>+84.6 [+61.5, +100.0]</w:t>
+              <w:t>+63.1 [+57.1, +69.0]</w:t>
             </w:r>
           </w:p>
         </w:tc>
@@ -4039,7 +4039,7 @@
               <w:rPr>
                 <w:sz w:val="14"/>
               </w:rPr>
-              <w:t>84.6</w:t>
+              <w:t>63.1</w:t>
             </w:r>
           </w:p>
         </w:tc>
@@ -4053,7 +4053,7 @@
               <w:rPr>
                 <w:sz w:val="14"/>
               </w:rPr>
-              <w:t>94.4</w:t>
+              <w:t>83.4</w:t>
             </w:r>
           </w:p>
         </w:tc>
@@ -4067,7 +4067,7 @@
               <w:rPr>
                 <w:sz w:val="14"/>
               </w:rPr>
-              <w:t>73.7</w:t>
+              <w:t>66.7</w:t>
             </w:r>
           </w:p>
         </w:tc>
@@ -4081,7 +4081,7 @@
               <w:rPr>
                 <w:sz w:val="14"/>
               </w:rPr>
-              <w:t>130</w:t>
+              <w:t>168</w:t>
             </w:r>
           </w:p>
         </w:tc>
@@ -4095,7 +4095,7 @@
               <w:rPr>
                 <w:sz w:val="14"/>
               </w:rPr>
-              <w:t>0.01</w:t>
+              <w:t>5.37</w:t>
             </w:r>
           </w:p>
         </w:tc>
@@ -4109,7 +4109,7 @@
               <w:rPr>
                 <w:sz w:val="14"/>
               </w:rPr>
-              <w:t>0.0</w:t>
+              <w:t>8.7</w:t>
             </w:r>
           </w:p>
         </w:tc>
@@ -4123,7 +4123,7 @@
               <w:rPr>
                 <w:sz w:val="14"/>
               </w:rPr>
-              <w:t>0.000</w:t>
+              <w:t>0.001</w:t>
             </w:r>
           </w:p>
         </w:tc>
@@ -4137,7 +4137,7 @@
               <w:rPr>
                 <w:sz w:val="14"/>
               </w:rPr>
-              <w:t>0.00</w:t>
+              <w:t>1.17</w:t>
             </w:r>
           </w:p>
         </w:tc>
@@ -4195,7 +4195,7 @@
               <w:rPr>
                 <w:sz w:val="14"/>
               </w:rPr>
-              <w:t>84.6</w:t>
+              <w:t>62.3</w:t>
             </w:r>
           </w:p>
         </w:tc>
@@ -4209,7 +4209,7 @@
               <w:rPr>
                 <w:sz w:val="14"/>
               </w:rPr>
-              <w:t>94.4</w:t>
+              <w:t>83.2</w:t>
             </w:r>
           </w:p>
         </w:tc>
@@ -4223,7 +4223,7 @@
               <w:rPr>
                 <w:sz w:val="14"/>
               </w:rPr>
-              <w:t>74.2</w:t>
+              <w:t>66.3</w:t>
             </w:r>
           </w:p>
         </w:tc>
@@ -4237,7 +4237,7 @@
               <w:rPr>
                 <w:sz w:val="14"/>
               </w:rPr>
-              <w:t>127</w:t>
+              <w:t>170</w:t>
             </w:r>
           </w:p>
         </w:tc>
@@ -4251,7 +4251,7 @@
               <w:rPr>
                 <w:sz w:val="14"/>
               </w:rPr>
-              <w:t>0.00</w:t>
+              <w:t>7.49</w:t>
             </w:r>
           </w:p>
         </w:tc>
@@ -4265,7 +4265,7 @@
               <w:rPr>
                 <w:sz w:val="14"/>
               </w:rPr>
-              <w:t>0.0</w:t>
+              <w:t>9.1</w:t>
             </w:r>
           </w:p>
         </w:tc>
@@ -4279,7 +4279,7 @@
               <w:rPr>
                 <w:sz w:val="14"/>
               </w:rPr>
-              <w:t>0.000</w:t>
+              <w:t>0.002</w:t>
             </w:r>
           </w:p>
         </w:tc>
@@ -4293,7 +4293,7 @@
               <w:rPr>
                 <w:sz w:val="14"/>
               </w:rPr>
-              <w:t>0.00</w:t>
+              <w:t>1.23</w:t>
             </w:r>
           </w:p>
         </w:tc>
@@ -4307,7 +4307,7 @@
               <w:rPr>
                 <w:sz w:val="14"/>
               </w:rPr>
-              <w:t>+0.0 [+0.0, +0.0]</w:t>
+              <w:t>+0.8 [-1.6, +3.2]</w:t>
             </w:r>
           </w:p>
         </w:tc>
@@ -4351,7 +4351,7 @@
               <w:rPr>
                 <w:sz w:val="14"/>
               </w:rPr>
-              <w:t>46.2</w:t>
+              <w:t>40.1</w:t>
             </w:r>
           </w:p>
         </w:tc>
@@ -4365,7 +4365,7 @@
               <w:rPr>
                 <w:sz w:val="14"/>
               </w:rPr>
-              <w:t>71.4</w:t>
+              <w:t>68.1</w:t>
             </w:r>
           </w:p>
         </w:tc>
@@ -4379,7 +4379,7 @@
               <w:rPr>
                 <w:sz w:val="14"/>
               </w:rPr>
-              <w:t>58.5</w:t>
+              <w:t>54.4</w:t>
             </w:r>
           </w:p>
         </w:tc>
@@ -4393,7 +4393,7 @@
               <w:rPr>
                 <w:sz w:val="14"/>
               </w:rPr>
-              <w:t>190</w:t>
+              <w:t>215</w:t>
             </w:r>
           </w:p>
         </w:tc>
@@ -4407,7 +4407,7 @@
               <w:rPr>
                 <w:sz w:val="14"/>
               </w:rPr>
-              <w:t>0.00</w:t>
+              <w:t>3.12</w:t>
             </w:r>
           </w:p>
         </w:tc>
@@ -4421,7 +4421,7 @@
               <w:rPr>
                 <w:sz w:val="14"/>
               </w:rPr>
-              <w:t>0.0</w:t>
+              <w:t>6.3</w:t>
             </w:r>
           </w:p>
         </w:tc>
@@ -4435,7 +4435,7 @@
               <w:rPr>
                 <w:sz w:val="14"/>
               </w:rPr>
-              <w:t>0.000</w:t>
+              <w:t>0.009</w:t>
             </w:r>
           </w:p>
         </w:tc>
@@ -4449,7 +4449,7 @@
               <w:rPr>
                 <w:sz w:val="14"/>
               </w:rPr>
-              <w:t>0.00</w:t>
+              <w:t>1.21</w:t>
             </w:r>
           </w:p>
         </w:tc>
@@ -4463,7 +4463,7 @@
               <w:rPr>
                 <w:sz w:val="14"/>
               </w:rPr>
-              <w:t>+38.5 [+15.4, +61.5]</w:t>
+              <w:t>+23.0 [+17.1, +29.0]</w:t>
             </w:r>
           </w:p>
         </w:tc>
@@ -4507,7 +4507,7 @@
               <w:rPr>
                 <w:sz w:val="14"/>
               </w:rPr>
-              <w:t>46.2</w:t>
+              <w:t>32.5</w:t>
             </w:r>
           </w:p>
         </w:tc>
@@ -4521,7 +4521,7 @@
               <w:rPr>
                 <w:sz w:val="14"/>
               </w:rPr>
-              <w:t>73.2</w:t>
+              <w:t>60.6</w:t>
             </w:r>
           </w:p>
         </w:tc>
@@ -4535,7 +4535,7 @@
               <w:rPr>
                 <w:sz w:val="14"/>
               </w:rPr>
-              <w:t>58.2</w:t>
+              <w:t>47.7</w:t>
             </w:r>
           </w:p>
         </w:tc>
@@ -4549,7 +4549,7 @@
               <w:rPr>
                 <w:sz w:val="14"/>
               </w:rPr>
-              <w:t>202</w:t>
+              <w:t>238</w:t>
             </w:r>
           </w:p>
         </w:tc>
@@ -4563,7 +4563,7 @@
               <w:rPr>
                 <w:sz w:val="14"/>
               </w:rPr>
-              <w:t>0.04</w:t>
+              <w:t>4.26</w:t>
             </w:r>
           </w:p>
         </w:tc>
@@ -4577,7 +4577,7 @@
               <w:rPr>
                 <w:sz w:val="14"/>
               </w:rPr>
-              <w:t>0.0</w:t>
+              <w:t>5.2</w:t>
             </w:r>
           </w:p>
         </w:tc>
@@ -4605,7 +4605,7 @@
               <w:rPr>
                 <w:sz w:val="14"/>
               </w:rPr>
-              <w:t>0.00</w:t>
+              <w:t>1.00</w:t>
             </w:r>
           </w:p>
         </w:tc>
@@ -4619,7 +4619,7 @@
               <w:rPr>
                 <w:sz w:val="14"/>
               </w:rPr>
-              <w:t>+38.5 [+15.4, +61.5]</w:t>
+              <w:t>+30.6 [+23.8, +37.3]</w:t>
             </w:r>
           </w:p>
         </w:tc>
@@ -4663,7 +4663,7 @@
               <w:rPr>
                 <w:sz w:val="14"/>
               </w:rPr>
-              <w:t>46.2</w:t>
+              <w:t>37.3</w:t>
             </w:r>
           </w:p>
         </w:tc>
@@ -4677,7 +4677,7 @@
               <w:rPr>
                 <w:sz w:val="14"/>
               </w:rPr>
-              <w:t>69.5</w:t>
+              <w:t>67.4</w:t>
             </w:r>
           </w:p>
         </w:tc>
@@ -4691,7 +4691,7 @@
               <w:rPr>
                 <w:sz w:val="14"/>
               </w:rPr>
-              <w:t>56.0</w:t>
+              <w:t>53.5</w:t>
             </w:r>
           </w:p>
         </w:tc>
@@ -4705,7 +4705,7 @@
               <w:rPr>
                 <w:sz w:val="14"/>
               </w:rPr>
-              <w:t>196</w:t>
+              <w:t>219</w:t>
             </w:r>
           </w:p>
         </w:tc>
@@ -4719,7 +4719,7 @@
               <w:rPr>
                 <w:sz w:val="14"/>
               </w:rPr>
-              <w:t>3.73</w:t>
+              <w:t>5.54</w:t>
             </w:r>
           </w:p>
         </w:tc>
@@ -4733,7 +4733,7 @@
               <w:rPr>
                 <w:sz w:val="14"/>
               </w:rPr>
-              <w:t>7.7</w:t>
+              <w:t>12.3</w:t>
             </w:r>
           </w:p>
         </w:tc>
@@ -4747,7 +4747,7 @@
               <w:rPr>
                 <w:sz w:val="14"/>
               </w:rPr>
-              <w:t>0.000</w:t>
+              <w:t>0.020</w:t>
             </w:r>
           </w:p>
         </w:tc>
@@ -4761,7 +4761,7 @@
               <w:rPr>
                 <w:sz w:val="14"/>
               </w:rPr>
-              <w:t>0.00</w:t>
+              <w:t>1.23</w:t>
             </w:r>
           </w:p>
         </w:tc>
@@ -4775,7 +4775,7 @@
               <w:rPr>
                 <w:sz w:val="14"/>
               </w:rPr>
-              <w:t>+38.5 [+15.4, +61.5]</w:t>
+              <w:t>+25.8 [+19.4, +32.1]</w:t>
             </w:r>
           </w:p>
         </w:tc>
@@ -4819,7 +4819,7 @@
               <w:rPr>
                 <w:sz w:val="14"/>
               </w:rPr>
-              <w:t>7.7</w:t>
+              <w:t>18.7</w:t>
             </w:r>
           </w:p>
         </w:tc>
@@ -4833,7 +4833,7 @@
               <w:rPr>
                 <w:sz w:val="14"/>
               </w:rPr>
-              <w:t>36.6</w:t>
+              <w:t>54.0</w:t>
             </w:r>
           </w:p>
         </w:tc>
@@ -4847,7 +4847,7 @@
               <w:rPr>
                 <w:sz w:val="14"/>
               </w:rPr>
-              <w:t>33.2</w:t>
+              <w:t>44.4</w:t>
             </w:r>
           </w:p>
         </w:tc>
@@ -4861,7 +4861,7 @@
               <w:rPr>
                 <w:sz w:val="14"/>
               </w:rPr>
-              <w:t>282</w:t>
+              <w:t>261</w:t>
             </w:r>
           </w:p>
         </w:tc>
@@ -4875,7 +4875,7 @@
               <w:rPr>
                 <w:sz w:val="14"/>
               </w:rPr>
-              <w:t>57.52</w:t>
+              <w:t>20.80</w:t>
             </w:r>
           </w:p>
         </w:tc>
@@ -4889,7 +4889,7 @@
               <w:rPr>
                 <w:sz w:val="14"/>
               </w:rPr>
-              <w:t>46.2</w:t>
+              <w:t>24.6</w:t>
             </w:r>
           </w:p>
         </w:tc>
@@ -4903,7 +4903,7 @@
               <w:rPr>
                 <w:sz w:val="14"/>
               </w:rPr>
-              <w:t>0.340</w:t>
+              <w:t>0.031</w:t>
             </w:r>
           </w:p>
         </w:tc>
@@ -4917,7 +4917,7 @@
               <w:rPr>
                 <w:sz w:val="14"/>
               </w:rPr>
-              <w:t>10.88</w:t>
+              <w:t>2.07</w:t>
             </w:r>
           </w:p>
         </w:tc>
@@ -4931,7 +4931,7 @@
               <w:rPr>
                 <w:sz w:val="14"/>
               </w:rPr>
-              <w:t>+76.9 [+53.8, +100.0]</w:t>
+              <w:t>+44.4 [+38.5, +50.8]</w:t>
             </w:r>
           </w:p>
         </w:tc>
@@ -4989,7 +4989,7 @@
               <w:rPr>
                 <w:sz w:val="14"/>
               </w:rPr>
-              <w:t>15.4</w:t>
+              <w:t>12.8</w:t>
             </w:r>
           </w:p>
         </w:tc>
@@ -5003,7 +5003,7 @@
               <w:rPr>
                 <w:sz w:val="14"/>
               </w:rPr>
-              <w:t>11.7</w:t>
+              <w:t>9.4</w:t>
             </w:r>
           </w:p>
         </w:tc>
@@ -5031,7 +5031,7 @@
               <w:rPr>
                 <w:sz w:val="14"/>
               </w:rPr>
-              <w:t>6.43</w:t>
+              <w:t>2.98</w:t>
             </w:r>
           </w:p>
         </w:tc>
@@ -5045,7 +5045,7 @@
               <w:rPr>
                 <w:sz w:val="14"/>
               </w:rPr>
-              <w:t>7.7</w:t>
+              <w:t>6.7</w:t>
             </w:r>
           </w:p>
         </w:tc>
@@ -5073,7 +5073,7 @@
               <w:rPr>
                 <w:sz w:val="14"/>
               </w:rPr>
-              <w:t>0.00</w:t>
+              <w:t>0.01</w:t>
             </w:r>
           </w:p>
         </w:tc>
@@ -5087,7 +5087,7 @@
               <w:rPr>
                 <w:sz w:val="14"/>
               </w:rPr>
-              <w:t>+84.6 [+61.5, +100.0]</w:t>
+              <w:t>+63.1 [+57.1, +69.0]</w:t>
             </w:r>
           </w:p>
         </w:tc>
@@ -5131,7 +5131,7 @@
               <w:rPr>
                 <w:sz w:val="14"/>
               </w:rPr>
-              <w:t>84.6</w:t>
+              <w:t>59.5</w:t>
             </w:r>
           </w:p>
         </w:tc>
@@ -5145,7 +5145,7 @@
               <w:rPr>
                 <w:sz w:val="14"/>
               </w:rPr>
-              <w:t>96.3</w:t>
+              <w:t>83.7</w:t>
             </w:r>
           </w:p>
         </w:tc>
@@ -5159,7 +5159,7 @@
               <w:rPr>
                 <w:sz w:val="14"/>
               </w:rPr>
-              <w:t>76.2</w:t>
+              <w:t>66.7</w:t>
             </w:r>
           </w:p>
         </w:tc>
@@ -5173,7 +5173,7 @@
               <w:rPr>
                 <w:sz w:val="14"/>
               </w:rPr>
-              <w:t>134</w:t>
+              <w:t>178</w:t>
             </w:r>
           </w:p>
         </w:tc>
@@ -5187,7 +5187,7 @@
               <w:rPr>
                 <w:sz w:val="14"/>
               </w:rPr>
-              <w:t>0.01</w:t>
+              <w:t>6.46</w:t>
             </w:r>
           </w:p>
         </w:tc>
@@ -5201,7 +5201,7 @@
               <w:rPr>
                 <w:sz w:val="14"/>
               </w:rPr>
-              <w:t>0.0</w:t>
+              <w:t>9.9</w:t>
             </w:r>
           </w:p>
         </w:tc>
@@ -5229,7 +5229,7 @@
               <w:rPr>
                 <w:sz w:val="14"/>
               </w:rPr>
-              <w:t>0.00</w:t>
+              <w:t>0.03</w:t>
             </w:r>
           </w:p>
         </w:tc>
@@ -5243,7 +5243,7 @@
               <w:rPr>
                 <w:sz w:val="14"/>
               </w:rPr>
-              <w:t>+0.0 [+0.0, +0.0]</w:t>
+              <w:t>+3.6 [+0.0, +7.1]</w:t>
             </w:r>
           </w:p>
         </w:tc>
@@ -5287,7 +5287,7 @@
               <w:rPr>
                 <w:sz w:val="14"/>
               </w:rPr>
-              <w:t>84.6</w:t>
+              <w:t>60.7</w:t>
             </w:r>
           </w:p>
         </w:tc>
@@ -5301,7 +5301,7 @@
               <w:rPr>
                 <w:sz w:val="14"/>
               </w:rPr>
-              <w:t>96.3</w:t>
+              <w:t>83.8</w:t>
             </w:r>
           </w:p>
         </w:tc>
@@ -5315,7 +5315,7 @@
               <w:rPr>
                 <w:sz w:val="14"/>
               </w:rPr>
-              <w:t>76.3</w:t>
+              <w:t>66.7</w:t>
             </w:r>
           </w:p>
         </w:tc>
@@ -5329,7 +5329,7 @@
               <w:rPr>
                 <w:sz w:val="14"/>
               </w:rPr>
-              <w:t>133</w:t>
+              <w:t>178</w:t>
             </w:r>
           </w:p>
         </w:tc>
@@ -5343,7 +5343,7 @@
               <w:rPr>
                 <w:sz w:val="14"/>
               </w:rPr>
-              <w:t>0.00</w:t>
+              <w:t>5.94</w:t>
             </w:r>
           </w:p>
         </w:tc>
@@ -5357,7 +5357,7 @@
               <w:rPr>
                 <w:sz w:val="14"/>
               </w:rPr>
-              <w:t>0.0</w:t>
+              <w:t>8.7</w:t>
             </w:r>
           </w:p>
         </w:tc>
@@ -5385,7 +5385,7 @@
               <w:rPr>
                 <w:sz w:val="14"/>
               </w:rPr>
-              <w:t>0.00</w:t>
+              <w:t>0.03</w:t>
             </w:r>
           </w:p>
         </w:tc>
@@ -5399,7 +5399,7 @@
               <w:rPr>
                 <w:sz w:val="14"/>
               </w:rPr>
-              <w:t>+0.0 [+0.0, +0.0]</w:t>
+              <w:t>+2.4 [-1.6, +6.7]</w:t>
             </w:r>
           </w:p>
         </w:tc>
@@ -5443,7 +5443,7 @@
               <w:rPr>
                 <w:sz w:val="14"/>
               </w:rPr>
-              <w:t>46.2</w:t>
+              <w:t>36.5</w:t>
             </w:r>
           </w:p>
         </w:tc>
@@ -5457,7 +5457,7 @@
               <w:rPr>
                 <w:sz w:val="14"/>
               </w:rPr>
-              <w:t>77.3</w:t>
+              <w:t>68.8</w:t>
             </w:r>
           </w:p>
         </w:tc>
@@ -5471,7 +5471,7 @@
               <w:rPr>
                 <w:sz w:val="14"/>
               </w:rPr>
-              <w:t>63.2</w:t>
+              <w:t>55.0</w:t>
             </w:r>
           </w:p>
         </w:tc>
@@ -5485,7 +5485,7 @@
               <w:rPr>
                 <w:sz w:val="14"/>
               </w:rPr>
-              <w:t>193</w:t>
+              <w:t>225</w:t>
             </w:r>
           </w:p>
         </w:tc>
@@ -5499,7 +5499,7 @@
               <w:rPr>
                 <w:sz w:val="14"/>
               </w:rPr>
-              <w:t>0.00</w:t>
+              <w:t>4.36</w:t>
             </w:r>
           </w:p>
         </w:tc>
@@ -5513,7 +5513,7 @@
               <w:rPr>
                 <w:sz w:val="14"/>
               </w:rPr>
-              <w:t>0.0</w:t>
+              <w:t>7.5</w:t>
             </w:r>
           </w:p>
         </w:tc>
@@ -5541,7 +5541,7 @@
               <w:rPr>
                 <w:sz w:val="14"/>
               </w:rPr>
-              <w:t>0.00</w:t>
+              <w:t>0.03</w:t>
             </w:r>
           </w:p>
         </w:tc>
@@ -5555,7 +5555,7 @@
               <w:rPr>
                 <w:sz w:val="14"/>
               </w:rPr>
-              <w:t>+38.5 [+15.4, +61.5]</w:t>
+              <w:t>+26.6 [+20.2, +32.9]</w:t>
             </w:r>
           </w:p>
         </w:tc>
@@ -5599,7 +5599,7 @@
               <w:rPr>
                 <w:sz w:val="14"/>
               </w:rPr>
-              <w:t>38.5</w:t>
+              <w:t>31.7</w:t>
             </w:r>
           </w:p>
         </w:tc>
@@ -5613,7 +5613,7 @@
               <w:rPr>
                 <w:sz w:val="14"/>
               </w:rPr>
-              <w:t>76.2</w:t>
+              <w:t>61.1</w:t>
             </w:r>
           </w:p>
         </w:tc>
@@ -5627,7 +5627,7 @@
               <w:rPr>
                 <w:sz w:val="14"/>
               </w:rPr>
-              <w:t>62.0</w:t>
+              <w:t>48.1</w:t>
             </w:r>
           </w:p>
         </w:tc>
@@ -5641,7 +5641,7 @@
               <w:rPr>
                 <w:sz w:val="14"/>
               </w:rPr>
-              <w:t>204</w:t>
+              <w:t>242</w:t>
             </w:r>
           </w:p>
         </w:tc>
@@ -5655,7 +5655,7 @@
               <w:rPr>
                 <w:sz w:val="14"/>
               </w:rPr>
-              <w:t>0.04</w:t>
+              <w:t>5.94</w:t>
             </w:r>
           </w:p>
         </w:tc>
@@ -5669,7 +5669,7 @@
               <w:rPr>
                 <w:sz w:val="14"/>
               </w:rPr>
-              <w:t>0.0</w:t>
+              <w:t>6.3</w:t>
             </w:r>
           </w:p>
         </w:tc>
@@ -5683,7 +5683,7 @@
               <w:rPr>
                 <w:sz w:val="14"/>
               </w:rPr>
-              <w:t>0.000</w:t>
+              <w:t>0.056</w:t>
             </w:r>
           </w:p>
         </w:tc>
@@ -5697,7 +5697,7 @@
               <w:rPr>
                 <w:sz w:val="14"/>
               </w:rPr>
-              <w:t>0.00</w:t>
+              <w:t>0.55</w:t>
             </w:r>
           </w:p>
         </w:tc>
@@ -5711,7 +5711,7 @@
               <w:rPr>
                 <w:sz w:val="14"/>
               </w:rPr>
-              <w:t>+46.2 [+23.1, +69.2]</w:t>
+              <w:t>+31.3 [+24.2, +38.1]</w:t>
             </w:r>
           </w:p>
         </w:tc>
@@ -5755,7 +5755,7 @@
               <w:rPr>
                 <w:sz w:val="14"/>
               </w:rPr>
-              <w:t>38.5</w:t>
+              <w:t>33.3</w:t>
             </w:r>
           </w:p>
         </w:tc>
@@ -5769,7 +5769,7 @@
               <w:rPr>
                 <w:sz w:val="14"/>
               </w:rPr>
-              <w:t>69.5</w:t>
+              <w:t>68.1</w:t>
             </w:r>
           </w:p>
         </w:tc>
@@ -5783,7 +5783,7 @@
               <w:rPr>
                 <w:sz w:val="14"/>
               </w:rPr>
-              <w:t>58.3</w:t>
+              <w:t>54.2</w:t>
             </w:r>
           </w:p>
         </w:tc>
@@ -5797,7 +5797,7 @@
               <w:rPr>
                 <w:sz w:val="14"/>
               </w:rPr>
-              <w:t>202</w:t>
+              <w:t>228</w:t>
             </w:r>
           </w:p>
         </w:tc>
@@ -5811,7 +5811,7 @@
               <w:rPr>
                 <w:sz w:val="14"/>
               </w:rPr>
-              <w:t>3.70</w:t>
+              <w:t>5.51</w:t>
             </w:r>
           </w:p>
         </w:tc>
@@ -5825,7 +5825,7 @@
               <w:rPr>
                 <w:sz w:val="14"/>
               </w:rPr>
-              <w:t>7.7</w:t>
+              <w:t>14.7</w:t>
             </w:r>
           </w:p>
         </w:tc>
@@ -5853,7 +5853,7 @@
               <w:rPr>
                 <w:sz w:val="14"/>
               </w:rPr>
-              <w:t>0.00</w:t>
+              <w:t>0.03</w:t>
             </w:r>
           </w:p>
         </w:tc>
@@ -5867,7 +5867,7 @@
               <w:rPr>
                 <w:sz w:val="14"/>
               </w:rPr>
-              <w:t>+46.2 [+23.1, +69.2]</w:t>
+              <w:t>+29.8 [+23.4, +36.1]</w:t>
             </w:r>
           </w:p>
         </w:tc>
@@ -5911,7 +5911,7 @@
               <w:rPr>
                 <w:sz w:val="14"/>
               </w:rPr>
-              <w:t>7.7</w:t>
+              <w:t>15.9</w:t>
             </w:r>
           </w:p>
         </w:tc>
@@ -5925,7 +5925,7 @@
               <w:rPr>
                 <w:sz w:val="14"/>
               </w:rPr>
-              <w:t>46.3</w:t>
+              <w:t>54.4</w:t>
             </w:r>
           </w:p>
         </w:tc>
@@ -5939,7 +5939,7 @@
               <w:rPr>
                 <w:sz w:val="14"/>
               </w:rPr>
-              <w:t>41.4</w:t>
+              <w:t>45.1</w:t>
             </w:r>
           </w:p>
         </w:tc>
@@ -5953,7 +5953,7 @@
               <w:rPr>
                 <w:sz w:val="14"/>
               </w:rPr>
-              <w:t>282</w:t>
+              <w:t>266</w:t>
             </w:r>
           </w:p>
         </w:tc>
@@ -5967,7 +5967,7 @@
               <w:rPr>
                 <w:sz w:val="14"/>
               </w:rPr>
-              <w:t>42.39</w:t>
+              <w:t>20.29</w:t>
             </w:r>
           </w:p>
         </w:tc>
@@ -5981,7 +5981,7 @@
               <w:rPr>
                 <w:sz w:val="14"/>
               </w:rPr>
-              <w:t>38.5</w:t>
+              <w:t>25.4</w:t>
             </w:r>
           </w:p>
         </w:tc>
@@ -6009,7 +6009,7 @@
               <w:rPr>
                 <w:sz w:val="14"/>
               </w:rPr>
-              <w:t>0.00</w:t>
+              <w:t>0.03</w:t>
             </w:r>
           </w:p>
         </w:tc>
@@ -6023,7 +6023,7 @@
               <w:rPr>
                 <w:sz w:val="14"/>
               </w:rPr>
-              <w:t>+76.9 [+53.8, +100.0]</w:t>
+              <w:t>+47.2 [+40.9, +53.2]</w:t>
             </w:r>
           </w:p>
         </w:tc>
@@ -6081,7 +6081,7 @@
               <w:rPr>
                 <w:sz w:val="14"/>
               </w:rPr>
-              <w:t>19.0</w:t>
+              <w:t>15.0</w:t>
             </w:r>
           </w:p>
         </w:tc>
@@ -6095,7 +6095,7 @@
               <w:rPr>
                 <w:sz w:val="14"/>
               </w:rPr>
-              <w:t>13.4</w:t>
+              <w:t>11.2</w:t>
             </w:r>
           </w:p>
         </w:tc>
@@ -6123,7 +6123,7 @@
               <w:rPr>
                 <w:sz w:val="14"/>
               </w:rPr>
-              <w:t>6.43</w:t>
+              <w:t>3.09</w:t>
             </w:r>
           </w:p>
         </w:tc>
@@ -6137,7 +6137,7 @@
               <w:rPr>
                 <w:sz w:val="14"/>
               </w:rPr>
-              <w:t>7.7</w:t>
+              <w:t>6.0</w:t>
             </w:r>
           </w:p>
         </w:tc>
@@ -6151,7 +6151,7 @@
               <w:rPr>
                 <w:sz w:val="14"/>
               </w:rPr>
-              <w:t>0.000</w:t>
+              <w:t>0.019</w:t>
             </w:r>
           </w:p>
         </w:tc>
@@ -6165,7 +6165,7 @@
               <w:rPr>
                 <w:sz w:val="14"/>
               </w:rPr>
-              <w:t>0.00</w:t>
+              <w:t>0.10</w:t>
             </w:r>
           </w:p>
         </w:tc>
@@ -6179,7 +6179,7 @@
               <w:rPr>
                 <w:sz w:val="14"/>
               </w:rPr>
-              <w:t>+84.6 [+61.5, +100.0]</w:t>
+              <w:t>+63.1 [+57.1, +69.0]</w:t>
             </w:r>
           </w:p>
         </w:tc>
@@ -6223,7 +6223,7 @@
               <w:rPr>
                 <w:sz w:val="14"/>
               </w:rPr>
-              <w:t>84.6</w:t>
+              <w:t>62.3</w:t>
             </w:r>
           </w:p>
         </w:tc>
@@ -6237,7 +6237,7 @@
               <w:rPr>
                 <w:sz w:val="14"/>
               </w:rPr>
-              <w:t>94.4</w:t>
+              <w:t>83.9</w:t>
             </w:r>
           </w:p>
         </w:tc>
@@ -6251,7 +6251,7 @@
               <w:rPr>
                 <w:sz w:val="14"/>
               </w:rPr>
-              <w:t>73.7</w:t>
+              <w:t>66.9</w:t>
             </w:r>
           </w:p>
         </w:tc>
@@ -6265,7 +6265,7 @@
               <w:rPr>
                 <w:sz w:val="14"/>
               </w:rPr>
-              <w:t>129</w:t>
+              <w:t>169</w:t>
             </w:r>
           </w:p>
         </w:tc>
@@ -6279,7 +6279,7 @@
               <w:rPr>
                 <w:sz w:val="14"/>
               </w:rPr>
-              <w:t>0.01</w:t>
+              <w:t>5.82</w:t>
             </w:r>
           </w:p>
         </w:tc>
@@ -6293,7 +6293,7 @@
               <w:rPr>
                 <w:sz w:val="14"/>
               </w:rPr>
-              <w:t>0.0</w:t>
+              <w:t>10.3</w:t>
             </w:r>
           </w:p>
         </w:tc>
@@ -6307,7 +6307,7 @@
               <w:rPr>
                 <w:sz w:val="14"/>
               </w:rPr>
-              <w:t>0.000</w:t>
+              <w:t>0.002</w:t>
             </w:r>
           </w:p>
         </w:tc>
@@ -6321,7 +6321,7 @@
               <w:rPr>
                 <w:sz w:val="14"/>
               </w:rPr>
-              <w:t>0.00</w:t>
+              <w:t>3.02</w:t>
             </w:r>
           </w:p>
         </w:tc>
@@ -6335,7 +6335,7 @@
               <w:rPr>
                 <w:sz w:val="14"/>
               </w:rPr>
-              <w:t>+0.0 [+0.0, +0.0]</w:t>
+              <w:t>+0.8 [+0.0, +2.0]</w:t>
             </w:r>
           </w:p>
         </w:tc>
@@ -6379,7 +6379,7 @@
               <w:rPr>
                 <w:sz w:val="14"/>
               </w:rPr>
-              <w:t>46.2</w:t>
+              <w:t>39.3</w:t>
             </w:r>
           </w:p>
         </w:tc>
@@ -6393,7 +6393,7 @@
               <w:rPr>
                 <w:sz w:val="14"/>
               </w:rPr>
-              <w:t>71.4</w:t>
+              <w:t>68.2</w:t>
             </w:r>
           </w:p>
         </w:tc>
@@ -6407,7 +6407,7 @@
               <w:rPr>
                 <w:sz w:val="14"/>
               </w:rPr>
-              <w:t>58.5</w:t>
+              <w:t>54.5</w:t>
             </w:r>
           </w:p>
         </w:tc>
@@ -6421,7 +6421,7 @@
               <w:rPr>
                 <w:sz w:val="14"/>
               </w:rPr>
-              <w:t>190</w:t>
+              <w:t>215</w:t>
             </w:r>
           </w:p>
         </w:tc>
@@ -6435,7 +6435,7 @@
               <w:rPr>
                 <w:sz w:val="14"/>
               </w:rPr>
-              <w:t>0.00</w:t>
+              <w:t>2.45</w:t>
             </w:r>
           </w:p>
         </w:tc>
@@ -6449,7 +6449,7 @@
               <w:rPr>
                 <w:sz w:val="14"/>
               </w:rPr>
-              <w:t>0.0</w:t>
+              <w:t>6.3</w:t>
             </w:r>
           </w:p>
         </w:tc>
@@ -6463,7 +6463,7 @@
               <w:rPr>
                 <w:sz w:val="14"/>
               </w:rPr>
-              <w:t>0.000</w:t>
+              <w:t>0.053</w:t>
             </w:r>
           </w:p>
         </w:tc>
@@ -6477,7 +6477,7 @@
               <w:rPr>
                 <w:sz w:val="14"/>
               </w:rPr>
-              <w:t>0.00</w:t>
+              <w:t>2.37</w:t>
             </w:r>
           </w:p>
         </w:tc>
@@ -6491,7 +6491,7 @@
               <w:rPr>
                 <w:sz w:val="14"/>
               </w:rPr>
-              <w:t>+38.5 [+15.4, +61.5]</w:t>
+              <w:t>+23.8 [+17.9, +29.8]</w:t>
             </w:r>
           </w:p>
         </w:tc>
@@ -6504,7 +6504,7 @@
         <w:rPr>
           <w:b w:val="0"/>
         </w:rPr>
-        <w:t>表3给出全部组合的结果。本文组合的 Strict 为 84.6%，在所有组合中最高或并列最高；最好的非本文局部层组合为"测地分配+TPG / 追踪+减速"（46.2%）。在局部层方面，固定全局层为测地分配+TPG 时，本文 84.6%、PAC-NMPC 46.2%、MPPI 46.2%、CBF-QP 7.7%、Turbo 0.0%、经典追踪 46.2%。在全局层方面，固定局部层为本文选择器时，测地分配+TPG 84.6%、STPG 84.6%、OT 分配 84.6%、无协调 84.6%；全局层之间的差别远小于局部层之间的差别，说明困难条件下的性能主要由局部层决定。TPG 与间距护盾的作用主要体现在集群互不影响指标上：无协调时间距违规为 0.0 pair·s，耦合暴露为 0.0，而测地分配+TPG 下分别为 0.0 和 0.0。</w:t>
+        <w:t>表3给出全部组合的结果。本文组合的 Strict 为 63.1%，在全部组合中最高（与STPG / 本文（学习预测选择）并列）；最好的非本文局部层组合为"测地分配+TPG / 追踪+减速"（40.1%）。在局部层方面，固定全局层为测地分配+TPG 时，本文 63.1%、PAC-NMPC 32.1%、MPPI 37.7%、CBF-QP 18.7%、Turbo 0.0%、经典追踪 40.1%。在全局层方面，固定局部层为本文选择器时，测地分配+TPG 63.1%、STPG 63.1%、OT 分配 59.5%、无协调 62.3%；全局层之间的差别远小于局部层之间的差别，说明困难条件下的性能主要由局部层决定。TPG 与间距护盾的作用主要体现在集群互不影响指标上：无协调时间距违规为 0.002 pair·s，耦合暴露为 3.02，而测地分配+TPG 下分别为 0.001 和 1.18。OT 分配倾向于让各集群就近负责血栓，集群路线重叠少，耦合暴露最低（0.027），但按总运输代价而非完工时间分配会拉长最慢集群的任务，T90_300 由 168 s 增至 178 s，Strict 降至 59.5%。STPG 与固定 TPG 的结果几乎相同，原因是在 N ≤ 3 的场景中冲突区交换顺序的机会很少。Turbo 在本任务训练域内重新训练（100 min，多层域随机化）后，仍未能在 300 s 内完成任何场景（清除率 12.8%）：直接速度策略需要同时学会长程路线跟随、到达减速和停留溶栓，在同等预算下难以收敛，这与 An 等报告的单目标导航任务有本质区别。</w:t>
       </w:r>
     </w:p>
     <w:p>
@@ -11526,7 +11526,7 @@
         <w:rPr>
           <w:b w:val="0"/>
         </w:rPr>
-        <w:t>在弱流、1 步延迟的 V5 设定下，本文框架落后于 Fixed Settle 与 STPG（后者的局部层同为追踪减速）6–9 个百分点。原因有二：一是此时经典规则已接近最优，选择器的额外动作只会引入扰动；二是选择器的权重是在流速标定后的困难条件下调出的，在 V5 独立调参集上调整不确定性锚定系数也未能消除这一差距。这一结果界定了本文方法的适用范围：它针对血流和延迟显著干扰经典规则的情形，在规则已足够好的简单情形中反而不如规则。</w:t>
+        <w:t>在弱流、1 步延迟的 V5 设定下（三档 s 平均），本文框架（种子 A）落后于 Fixed Settle 5.2 个百分点、STPG（局部层同为追踪减速）5.5 个百分点，但高于 SwitchSettle 10.6 个百分点（SwitchSettle 在 1 步延迟下处于 Adaptive 模式，强扰动时会误触发释放）。原因有二：一是此时经典规则已接近最优，选择器的额外动作只会引入扰动；二是选择器的权重是在流速标定后的困难条件下调出的，在 V5 独立调参集上调整不确定性锚定系数也未能消除这一差距。这一结果界定了本文方法的适用范围：它针对血流和延迟显著干扰经典规则的情形，在规则已足够好的简单情形中反而不如规则。</w:t>
       </w:r>
     </w:p>
     <w:p>
@@ -11719,7 +11719,7 @@
         <w:rPr>
           <w:b w:val="0"/>
         </w:rPr>
-        <w:t>本文面向"在多变血流与延迟成像下用多个磁性微机器人集群清除多个血栓"这一问题，提出了全局测地分配 + 时序计划图与局部预测辅助指令选择相结合的分层导航框架，并构建了包含 14 种解剖、多种流速—延迟—动力学条件的仿真基准。在困难条件下，框架的 Strict 成功率为 61.2%，比最强经典规则高 14 个百分点，并优于以 STPG、OT 分配为全局层，以 PAC-NMPC、MPPI、CBF-QP、Turbo 为局部层的全部外部方法组合，在三个独立种子间稳定。消融显示，提升主要来自"预测—选择"结构；学习预测器提供了更准确且校准良好的预测，但其控制增益尚未超过非学习的在线估计器；在弱流、低延迟条件下，框架仍落后于固定减速规则。这些结果为多集群血栓清除给出了一个可复现的强基线框架，也指明了学习组件下一步需要解决的问题。</w:t>
+        <w:t>本文面向"在多变血流与延迟成像下用多个磁性微机器人集群清除多个血栓"这一问题，提出了全局测地分配 + 时序计划图与局部预测辅助指令选择相结合的分层导航框架，并构建了包含 14 种解剖、多种流速—延迟—动力学条件的仿真基准。在困难条件下，框架的 Strict 成功率为 61.2%，比最强经典规则高 14 个百分点，并显著优于以 STPG、OT 分配为全局层，以 PAC-NMPC、MPPI、CBF-QP、Turbo 为局部层的外部方法组合，在三个独立种子间稳定。消融显示，提升主要来自"预测—选择"结构；学习预测器提供了更准确且校准良好的预测，但其控制增益尚未超过非学习的在线估计器；在弱流、低延迟条件下，框架仍落后于固定减速规则。这些结果为多集群血栓清除给出了一个可复现的强基线框架，也指明了学习组件下一步需要解决的问题。</w:t>
       </w:r>
     </w:p>
     <w:p>

</xml_diff>